<commit_message>
Retitle to reproducibility framing; correct Fig 2/Table 2 captions; rebuild figure index
</commit_message>
<xml_diff>
--- a/submission/Abstract and Keywords.docx
+++ b/submission/Abstract and Keywords.docx
@@ -9,25 +9,48 @@
     </w:p>
     <w:p>
       <w:r>
-        <w:t>Background. A pre-trained segmentation network returns a measurement for any image, with no mechanism for signaling that the acquisition lies outside its validated range. As radiological analysis is delegated to autonomous systems, the risk is not that a model is wrong but that nothing is obliged to notice.</w:t>
+        <w:rPr>
+          <w:b/>
+        </w:rPr>
+        <w:t xml:space="preserve">Background. </w:t>
+      </w:r>
+      <w:r>
+        <w:t>Reliability of automated radiological analysis is limited less by model accuracy than by having no mechanism to refuse. A pre-trained segmentation network returns a measurement for any image, including acquisitions outside its validated range, and when analysis is delegated to agents nothing is obliged to notice.</w:t>
       </w:r>
     </w:p>
     <w:p>
       <w:r>
-        <w:t>Methods. From four public TCGA collections in The Cancer Imaging Archive we identified 193 reconstruction pairs in 59 patients: two CT series from one irradiation event, confirmed by DICOM frame of reference and acquisition time, differing only in convolution kernel or slice thickness. This holds patient, anatomy, contrast and timing fixed. TotalSegmentator 2.18.0 measured heart, aorta, pulmonary vein and both venae cavae across 217 series, with three endpoints and a 10% threshold fixed in advance as executable assertions.</w:t>
+        <w:rPr>
+          <w:b/>
+        </w:rPr>
+        <w:t xml:space="preserve">Methods. </w:t>
+      </w:r>
+      <w:r>
+        <w:t>In The Cancer Imaging Archive we identified 193 reconstruction pairs in 59 patients: two CT series from one irradiation event, matched on DICOM frame of reference and acquisition time, differing only in convolution kernel or slice thickness, holding patient, anatomy, contrast and timing fixed. TotalSegmentator 2.18.0 measured heart, aorta, pulmonary vein and venae cavae across 217 series. Three endpoints and a 10% threshold were fixed in advance as assertions.</w:t>
       </w:r>
     </w:p>
     <w:p>
       <w:r>
-        <w:t>Results. An eligibility check halted the pre-specified cross-study endpoint at five patients, on metadata alone. A pre-specification assumption then proved false: reconstructions of one acquisition do not share z-coverage (median difference 15%), which predicts apparent volume difference (rho 0.70, aorta). In 45 coverage-matched pairs with thickness identical, kernel change altered heart volume by 0.63% (95% CI 0.50-0.97) and pulmonary vein by 4.96% (3.20-5.63); all intervals excluded 10%. Segmentation failed on 4 of 217 series. Association discordance did not exceed a permutation null (p=0.33).</w:t>
+        <w:rPr>
+          <w:b/>
+        </w:rPr>
+        <w:t xml:space="preserve">Results. </w:t>
+      </w:r>
+      <w:r>
+        <w:t>An eligibility check halted one endpoint at five patients, on metadata. A pre-specification assumption proved false: reconstructions of one acquisition need not share z-coverage (median difference 15%), which predicts apparent volume difference (rho 0.70). In 45 coverage-matched pairs of identical thickness, kernel change altered heart volume by 0.63% (95% CI 0.50-0.97) and pulmonary vein by 4.96% (3.20-5.63); all intervals excluded 10%. Segmentation failed on 4 of 217 series. Discordance of radiogenomic associations, volumes against tumour RNA-seq in the same patients, did not exceed a permutation null (p=0.33).</w:t>
       </w:r>
     </w:p>
     <w:p>
       <w:r>
-        <w:t>Conclusions. Automated whole-heart volumetry on chest CT is reproducible across kernels to about 1% when field of view is matched; thin vessels vary several times more. The failed assumption was written in advance, where it could not fail; measurement caught it.</w:t>
+        <w:rPr>
+          <w:b/>
+        </w:rPr>
+        <w:t xml:space="preserve">Conclusions. </w:t>
+      </w:r>
+      <w:r>
+        <w:t>Whole-heart volumetry on chest CT is reproducible across kernels to about 1% when field of view matches; thin vessels vary several times more. The failed assumption was prose, where it could not halt; measurement caught it.</w:t>
       </w:r>
     </w:p>
-    <w:p/>
     <w:p>
       <w:r>
         <w:t>Keywords</w:t>
@@ -35,7 +58,7 @@
     </w:p>
     <w:p>
       <w:r>
-        <w:t>Computed tomography; image reconstruction; automated segmentation; measurement reproducibility; radiogenomics; prespecification</w:t>
+        <w:t>Computed tomography; image reconstruction; automated segmentation; measurement reproducibility; autonomous agent</w:t>
       </w:r>
     </w:p>
     <w:sectPr>

</xml_diff>